<commit_message>
Print item labels, the choice notice and a grouped answer summary in Word
The question label cell now takes the paper's printed label as is, so essay
parts read «أ.» and a lone essay has no label. A centred bold paragraph
before the section bar carries the choice notice and keeps with it. The
answer summary prints one heading and one table per section, the loop
pattern Templify is pinned to support. Both templates are regenerated.

Co-Authored-By: Claude Fable 5.1 <noreply@anthropic.com>
</commit_message>
<xml_diff>
--- a/ExamTemplate.Documents/Word/ExamTemplate-ar.docx
+++ b/ExamTemplate.Documents/Word/ExamTemplate-ar.docx
@@ -582,6 +582,28 @@
         <w:t xml:space="preserve">ملخص الإجابات</w:t>
       </w:r>
     </w:p>
+    <w:p>
+      <w:pPr>
+        <w:pStyle w:val="TemplateControl"/>
+      </w:pPr>
+      <w:r>
+        <w:rPr>
+          <w:rtl/>
+        </w:rPr>
+        <w:t xml:space="preserve">{{#foreach g in SummaryGroups}}</w:t>
+      </w:r>
+    </w:p>
+    <w:p>
+      <w:pPr>
+        <w:pStyle w:val="ExamSummaryHeading"/>
+      </w:pPr>
+      <w:r>
+        <w:rPr>
+          <w:rtl/>
+        </w:rPr>
+        <w:t xml:space="preserve">{{g.Heading}}</w:t>
+      </w:r>
+    </w:p>
     <w:tbl>
       <w:tblPr>
         <w:bidiVisual/>
@@ -629,7 +651,7 @@
               <w:rPr>
                 <w:rtl/>
               </w:rPr>
-              <w:t xml:space="preserve">{{#foreach r in SummaryRows}}</w:t>
+              <w:t xml:space="preserve">{{#foreach r in g.Rows}}</w:t>
             </w:r>
           </w:p>
         </w:tc>
@@ -1032,6 +1054,17 @@
         </w:tc>
       </w:tr>
     </w:tbl>
+    <w:p>
+      <w:pPr>
+        <w:pStyle w:val="TemplateControl"/>
+      </w:pPr>
+      <w:r>
+        <w:rPr>
+          <w:rtl/>
+        </w:rPr>
+        <w:t xml:space="preserve">{{/foreach}}</w:t>
+      </w:r>
+    </w:p>
     <w:p>
       <w:pPr>
         <w:pStyle w:val="ExamSpacer"/>
@@ -1233,6 +1266,39 @@
           <w:rtl/>
         </w:rPr>
         <w:t xml:space="preserve">{{#foreach s in Sections}}</w:t>
+      </w:r>
+    </w:p>
+    <w:p>
+      <w:pPr>
+        <w:pStyle w:val="TemplateControl"/>
+      </w:pPr>
+      <w:r>
+        <w:rPr>
+          <w:rtl/>
+        </w:rPr>
+        <w:t xml:space="preserve">{{#if s.HasChoiceNotice}}</w:t>
+      </w:r>
+    </w:p>
+    <w:p>
+      <w:pPr>
+        <w:pStyle w:val="ExamChoiceNotice"/>
+      </w:pPr>
+      <w:r>
+        <w:rPr>
+          <w:rtl/>
+        </w:rPr>
+        <w:t xml:space="preserve">{{s.ChoiceNotice}}</w:t>
+      </w:r>
+    </w:p>
+    <w:p>
+      <w:pPr>
+        <w:pStyle w:val="TemplateControl"/>
+      </w:pPr>
+      <w:r>
+        <w:rPr>
+          <w:rtl/>
+        </w:rPr>
+        <w:t xml:space="preserve">{{/if}}</w:t>
       </w:r>
     </w:p>
     <w:p>
@@ -1451,7 +1517,7 @@
               <w:rPr>
                 <w:rtl/>
               </w:rPr>
-              <w:t xml:space="preserve">{{q.Number}}.</w:t>
+              <w:t xml:space="preserve">{{q.Label}}</w:t>
             </w:r>
           </w:p>
         </w:tc>
@@ -1633,7 +1699,7 @@
               <w:rPr>
                 <w:rtl/>
               </w:rPr>
-              <w:t xml:space="preserve">{{q.Number}}.</w:t>
+              <w:t xml:space="preserve">{{q.Label}}</w:t>
             </w:r>
           </w:p>
         </w:tc>
@@ -2993,14 +3059,14 @@
       <w:szCs w:val="22"/>
     </w:rPr>
   </w:style>
-  <w:style w:type="paragraph" w:customStyle="1" w:styleId="ExamSummaryNumber">
-    <w:name w:val="ExamSummaryNumber"/>
-    <w:basedOn w:val="Normal"/>
-    <w:qFormat/>
-    <w:pPr>
-      <w:bidi/>
-      <w:spacing w:before="0" w:after="0" w:line="240" w:lineRule="auto"/>
-      <w:jc w:val="center"/>
+  <w:style w:type="paragraph" w:customStyle="1" w:styleId="ExamSummaryHeading">
+    <w:name w:val="ExamSummaryHeading"/>
+    <w:basedOn w:val="Normal"/>
+    <w:qFormat/>
+    <w:pPr>
+      <w:keepNext/>
+      <w:bidi/>
+      <w:spacing w:before="60" w:after="20" w:line="240" w:lineRule="auto"/>
     </w:pPr>
     <w:rPr>
       <w:rFonts w:ascii="Noto Naskh Arabic" w:hAnsi="Noto Naskh Arabic" w:eastAsia="Noto Naskh Arabic" w:cs="Noto Naskh Arabic"/>
@@ -3011,6 +3077,24 @@
       <w:szCs w:val="20"/>
     </w:rPr>
   </w:style>
+  <w:style w:type="paragraph" w:customStyle="1" w:styleId="ExamSummaryNumber">
+    <w:name w:val="ExamSummaryNumber"/>
+    <w:basedOn w:val="Normal"/>
+    <w:qFormat/>
+    <w:pPr>
+      <w:bidi/>
+      <w:spacing w:before="0" w:after="0" w:line="240" w:lineRule="auto"/>
+      <w:jc w:val="center"/>
+    </w:pPr>
+    <w:rPr>
+      <w:rFonts w:ascii="Noto Naskh Arabic" w:hAnsi="Noto Naskh Arabic" w:eastAsia="Noto Naskh Arabic" w:cs="Noto Naskh Arabic"/>
+      <w:b/>
+      <w:bCs/>
+      <w:color w:val="000000"/>
+      <w:sz w:val="20"/>
+      <w:szCs w:val="20"/>
+    </w:rPr>
+  </w:style>
   <w:style w:type="paragraph" w:customStyle="1" w:styleId="ExamSummaryAnswer">
     <w:name w:val="ExamSummaryAnswer"/>
     <w:basedOn w:val="Normal"/>
@@ -3077,14 +3161,15 @@
       <w:szCs w:val="21"/>
     </w:rPr>
   </w:style>
-  <w:style w:type="paragraph" w:customStyle="1" w:styleId="ExamSectionTitle">
-    <w:name w:val="ExamSectionTitle"/>
+  <w:style w:type="paragraph" w:customStyle="1" w:styleId="ExamChoiceNotice">
+    <w:name w:val="ExamChoiceNotice"/>
     <w:basedOn w:val="Normal"/>
     <w:qFormat/>
     <w:pPr>
       <w:keepNext/>
       <w:bidi/>
-      <w:spacing w:before="0" w:after="0" w:line="240" w:lineRule="auto"/>
+      <w:spacing w:before="80" w:after="40" w:line="240" w:lineRule="auto"/>
+      <w:jc w:val="center"/>
     </w:pPr>
     <w:rPr>
       <w:rFonts w:ascii="Noto Naskh Arabic" w:hAnsi="Noto Naskh Arabic" w:eastAsia="Noto Naskh Arabic" w:cs="Noto Naskh Arabic"/>
@@ -3095,6 +3180,24 @@
       <w:szCs w:val="24"/>
     </w:rPr>
   </w:style>
+  <w:style w:type="paragraph" w:customStyle="1" w:styleId="ExamSectionTitle">
+    <w:name w:val="ExamSectionTitle"/>
+    <w:basedOn w:val="Normal"/>
+    <w:qFormat/>
+    <w:pPr>
+      <w:keepNext/>
+      <w:bidi/>
+      <w:spacing w:before="0" w:after="0" w:line="240" w:lineRule="auto"/>
+    </w:pPr>
+    <w:rPr>
+      <w:rFonts w:ascii="Noto Naskh Arabic" w:hAnsi="Noto Naskh Arabic" w:eastAsia="Noto Naskh Arabic" w:cs="Noto Naskh Arabic"/>
+      <w:b/>
+      <w:bCs/>
+      <w:color w:val="000000"/>
+      <w:sz w:val="24"/>
+      <w:szCs w:val="24"/>
+    </w:rPr>
+  </w:style>
   <w:style w:type="paragraph" w:customStyle="1" w:styleId="ExamSectionInstruction">
     <w:name w:val="ExamSectionInstruction"/>
     <w:basedOn w:val="Normal"/>

</xml_diff>